<commit_message>
docs: alinha o relatório com a revisão da interface de 25-10-2026
- 4.1: descreve a nova identidade e a comunicação das telas, sem
  alteração de esquema, permissões ou API.
- 5.8 e Tabela 27: reexecução dos testes e verificações complementares.
- 5.13: limitação explícita (decisões de design, sem avaliação com
  participantes).
- Apêndice B: 9 entradas passam a indicar a reexecução da suíte.
- Sumário: 5.10 e 5.13 atualizados após deslocação de página.

Edição direta do XML do DOCX atual; 72 páginas, 32 tabelas e 7 figuras.
Originais preservados em .local/report-2026-10-25/.

Co-Authored-By: Claude Opus 5.5 <noreply@anthropic.com>
</commit_message>
<xml_diff>
--- a/docs/report/tcc_antonewton.docx
+++ b/docs/report/tcc_antonewton.docx
@@ -1314,11 +1314,6 @@
               <w:rStyle w:val="IndexLink"/>
             </w:rPr>
             <w:instrText xml:space="preserve"> TOC \f \o "1-3" \h</w:instrText>
-          </w:r>
-          <w:r>
-            <w:rPr>
-              <w:rStyle w:val="IndexLink"/>
-            </w:rPr>
             <w:fldChar w:fldCharType="separate"/>
           </w:r>
           <w:hyperlink w:anchor="__RefHeading___Toc8673_1112290750">
@@ -2248,7 +2243,7 @@
               </w:rPr>
               <w:t>5.10 Avaliação de usabilidade: evidência pendente</w:t>
               <w:tab/>
-              <w:t>45</w:t>
+              <w:t>46</w:t>
             </w:r>
           </w:hyperlink>
         </w:p>
@@ -2308,7 +2303,7 @@
               </w:rPr>
               <w:t>5.13 Limitações e melhorias propostas</w:t>
               <w:tab/>
-              <w:t>47</w:t>
+              <w:t>48</w:t>
             </w:r>
           </w:hyperlink>
         </w:p>
@@ -4736,7 +4731,7 @@
       </w:pPr>
       <w:r>
         <w:rPr/>
-        <w:t>A área operacional /workspace apresenta painéis por papel e páginas próprias para consulta, criação e edição. A revisão de interface documentada em 8 de outubro de 2026 acrescenta pesquisa e paginação de oito registos no navegador. A startup pode gerir perfil, rondas, negociações, interações e documentos; investidores e aceleradoras consultam relações autorizadas. A identidade visual foi preservada. Nesta fase documental, a aplicação e a base de dados não foram alteradas nem se repetiram testes que criam registos.</w:t>
+        <w:t>A área operacional /workspace apresenta painéis por papel e páginas próprias para consulta, criação e edição. A revisão de interface documentada em 8 de outubro de 2026 acrescenta pesquisa e paginação de oito registos no navegador. A startup pode gerir perfil, rondas, negociações, interações e documentos; investidores e aceleradoras consultam relações autorizadas. Em 25 de outubro de 2026, a identidade visual foi simplificada, com superfícies neutras, uma única cor de destaque, tipografia única e novo símbolo, e a comunicação das telas foi revista: trilho de localização, indicação do resultado de cada formulário, aviso de consulta para investidores e aceleradoras e explicação das etapas no momento em que são escolhidas. O esquema da base de dados, as permissões e a API não foram alterados.</w:t>
       </w:r>
     </w:p>
     <w:p>
@@ -9552,11 +9547,7 @@
       </w:pPr>
       <w:r>
         <w:rPr/>
-        <w:t>“</w:t>
-      </w:r>
-      <w:r>
-        <w:rPr/>
-        <w:t>Angola, Portugal” permanece uma categoria conjunta. As respostas com várias localidades são mantidas sem recodificação administrativa: não se equipara Viana a província, nem se substitui “Luanda e Bengo” por uma única localização. Vinte registos indicam apenas Luanda e três a mencionam em respostas compostas; este padrão não permite generalizar para outras províncias.</w:t>
+        <w:t>“Angola, Portugal” permanece uma categoria conjunta. As respostas com várias localidades são mantidas sem recodificação administrativa: não se equipara Viana a província, nem se substitui “Luanda e Bengo” por uma única localização. Vinte registos indicam apenas Luanda e três a mencionam em respostas compostas; este padrão não permite generalizar para outras províncias.</w:t>
       </w:r>
     </w:p>
     <w:p>
@@ -20969,7 +20960,7 @@
       </w:pPr>
       <w:r>
         <w:rPr/>
-        <w:t>A evidência de 7 de outubro de 2026 documenta dois cenários Playwright. A revisão da interface de 8 de outubro documenta quatro cenários: um de integração HTTP e três de navegador, para startup, investidor e aceleradora. Os ficheiros tests/capture.spec.ts e tests/workspace-ui.spec.ts foram inspecionados nesta análise; os resultados de execução provêm dos registos anteriores em docs/verification/results.md e ui-review.md. A cobertura documentada inclui persistência após recarga, autorização, navegação, pesquisa, paginação, formulários e verificações axe WCAG 2 A/AA nos estados examinados. Não foram repetidos testes que modificam dados nesta revisão documental.</w:t>
+        <w:t>A evidência de 7 de outubro de 2026 documenta dois cenários Playwright. A revisão da interface de 8 de outubro documenta quatro cenários: um de integração HTTP e três de navegador, para startup, investidor e aceleradora. Os ficheiros tests/capture.spec.ts e tests/workspace-ui.spec.ts foram inspecionados nesta análise; os resultados de execução provêm dos registos anteriores em docs/verification/results.md e ui-review.md. A cobertura documentada inclui persistência após recarga, autorização, navegação, pesquisa, paginação, formulários e verificações axe WCAG 2 A/AA nos estados examinados. Em 25 de outubro de 2026, após a revisão da identidade visual e da comunicação da interface, os quatro cenários foram reexecutados com aprovação. Complementarmente, verificaram-se com axe as páginas públicas e 53 itens da área autenticada, em desktop e telemóvel, incluindo estados vazios, erro devolvido pelo servidor, navegação por teclado e indisponibilidade da base de dados. Estas execuções criaram registos fictícios na base de demonstração.</w:t>
       </w:r>
     </w:p>
     <w:p>
@@ -22272,7 +22263,7 @@
                 <w:szCs w:val="24"/>
                 <w:lang w:val="pt-PT" w:eastAsia="ja-JP" w:bidi="ar-SA"/>
               </w:rPr>
-              <w:t>Fluxo de criação, teclado, largura móvel e axe</w:t>
+              <w:t>Fluxo de criação, teclado, largura móvel, axe, estados vazios e de erro</w:t>
             </w:r>
           </w:p>
         </w:tc>
@@ -22306,7 +22297,7 @@
                 <w:szCs w:val="24"/>
                 <w:lang w:val="pt-PT" w:eastAsia="ja-JP" w:bidi="ar-SA"/>
               </w:rPr>
-              <w:t>Passou no cenário verificado</w:t>
+              <w:t>Passou no cenário verificado (reexecutado em 25-10-2026)</w:t>
             </w:r>
           </w:p>
         </w:tc>
@@ -24504,6 +24495,16 @@
     </w:p>
     <w:p>
       <w:pPr>
+        <w:pStyle w:val="Normal"/>
+        <w:rPr/>
+      </w:pPr>
+      <w:r>
+        <w:rPr/>
+        <w:t>A revisão da interface de 25 de outubro de 2026 resulta de decisões de design do autor. Apenas a explicação das etapas e dos denominadores se relaciona com as dificuldades declaradas na pesquisa. A nova identidade e a nova comunicação das telas não foram avaliadas com participantes e não demonstram ganhos de compreensão ou de usabilidade; essa avaliação continua a ser a primeira prioridade das recomendações futuras.</w:t>
+      </w:r>
+    </w:p>
+    <w:p>
+      <w:pPr>
         <w:pStyle w:val="Heading1"/>
         <w:rPr/>
       </w:pPr>
@@ -27526,7 +27527,7 @@
       </w:pPr>
       <w:r>
         <w:rPr/>
-        <w:t>Teste ou evidência: capture.spec.ts login e isolamento; inspeção estática 08-10-2026; execuções anteriores em docs/verification/results.md e ui-review.md, não repetidas nesta revisão.</w:t>
+        <w:t>Teste ou evidência: capture.spec.ts login e isolamento; inspeção estática 08-10-2026; suíte automatizada reexecutada com aprovação em 25-10-2026 (docs/verification/ui-review.md).</w:t>
       </w:r>
     </w:p>
     <w:p>
@@ -27628,7 +27629,7 @@
       </w:pPr>
       <w:r>
         <w:rPr/>
-        <w:t>Teste ou evidência: capture.spec.ts criação consulta recarga; inspeção estática 08-10-2026; execuções anteriores em docs/verification/results.md e ui-review.md, não repetidas nesta revisão.</w:t>
+        <w:t>Teste ou evidência: capture.spec.ts criação consulta recarga; inspeção estática 08-10-2026; suíte automatizada reexecutada com aprovação em 25-10-2026 (docs/verification/ui-review.md).</w:t>
       </w:r>
     </w:p>
     <w:p>
@@ -27730,7 +27731,7 @@
       </w:pPr>
       <w:r>
         <w:rPr/>
-        <w:t>Teste ou evidência: capture.spec.ts transições e duplicação; inspeção estática 08-10-2026; execuções anteriores em docs/verification/results.md e ui-review.md, não repetidas nesta revisão.</w:t>
+        <w:t>Teste ou evidência: capture.spec.ts transições e duplicação; inspeção estática 08-10-2026; suíte automatizada reexecutada com aprovação em 25-10-2026 (docs/verification/ui-review.md).</w:t>
       </w:r>
     </w:p>
     <w:p>
@@ -27832,7 +27833,7 @@
       </w:pPr>
       <w:r>
         <w:rPr/>
-        <w:t>Teste ou evidência: capture.spec.ts interação persistida; inspeção estática 08-10-2026; execuções anteriores em docs/verification/results.md e ui-review.md, não repetidas nesta revisão.</w:t>
+        <w:t>Teste ou evidência: capture.spec.ts interação persistida; inspeção estática 08-10-2026; suíte automatizada reexecutada com aprovação em 25-10-2026 (docs/verification/ui-review.md).</w:t>
       </w:r>
     </w:p>
     <w:p>
@@ -27934,7 +27935,7 @@
       </w:pPr>
       <w:r>
         <w:rPr/>
-        <w:t>Teste ou evidência: capture.spec.ts acesso negado concessão revogação e eliminação; inspeção estática 08-10-2026; execuções anteriores em docs/verification/results.md e ui-review.md, não repetidas nesta revisão.</w:t>
+        <w:t>Teste ou evidência: capture.spec.ts acesso negado concessão revogação e eliminação; inspeção estática 08-10-2026; suíte automatizada reexecutada com aprovação em 25-10-2026 (docs/verification/ui-review.md).</w:t>
       </w:r>
     </w:p>
     <w:p>
@@ -28036,7 +28037,7 @@
       </w:pPr>
       <w:r>
         <w:rPr/>
-        <w:t>Teste ou evidência: capture.spec.ts soft commit sem valor recusado e term sheet; inspeção estática 08-10-2026; execuções anteriores em docs/verification/results.md e ui-review.md, não repetidas nesta revisão.</w:t>
+        <w:t>Teste ou evidência: capture.spec.ts soft commit sem valor recusado e term sheet; inspeção estática 08-10-2026; suíte automatizada reexecutada com aprovação em 25-10-2026 (docs/verification/ui-review.md).</w:t>
       </w:r>
     </w:p>
     <w:p>
@@ -28138,7 +28139,7 @@
       </w:pPr>
       <w:r>
         <w:rPr/>
-        <w:t>Teste ou evidência: capture.spec.ts null 0% 100% e decimal; inspeção estática 08-10-2026; execuções anteriores em docs/verification/results.md e ui-review.md, não repetidas nesta revisão.</w:t>
+        <w:t>Teste ou evidência: capture.spec.ts null 0% 100% e decimal; inspeção estática 08-10-2026; suíte automatizada reexecutada com aprovação em 25-10-2026 (docs/verification/ui-review.md).</w:t>
       </w:r>
     </w:p>
     <w:p>
@@ -28240,7 +28241,7 @@
       </w:pPr>
       <w:r>
         <w:rPr/>
-        <w:t>Teste ou evidência: capture.spec.ts aceleradora lê negociação mas documento recusado; inspeção estática 08-10-2026; execuções anteriores em docs/verification/results.md e ui-review.md, não repetidas nesta revisão.</w:t>
+        <w:t>Teste ou evidência: capture.spec.ts aceleradora lê negociação mas documento recusado; inspeção estática 08-10-2026; suíte automatizada reexecutada com aprovação em 25-10-2026 (docs/verification/ui-review.md).</w:t>
       </w:r>
     </w:p>
     <w:p>
@@ -28444,7 +28445,7 @@
       </w:pPr>
       <w:r>
         <w:rPr/>
-        <w:t>Teste ou evidência: capture.spec.ts HTTP e axe + check-outage.mjs; inspeção estática 08-10-2026; execuções anteriores em docs/verification/results.md e ui-review.md, não repetidas nesta revisão.</w:t>
+        <w:t>Teste ou evidência: capture.spec.ts HTTP e axe + check-outage.mjs; inspeção estática 08-10-2026; suíte automatizada reexecutada com aprovação em 25-10-2026 (docs/verification/ui-review.md).</w:t>
       </w:r>
     </w:p>
     <w:p>

</xml_diff>